<commit_message>
Add cast_prompts_v2.json and sync the docs with the pushed state
cast_prompts_v2.json: team-authored 128-prompt set (pre-frozen, do not edit); the v2 scripts
read it from the repository root. CLAUDE.md and the handoff report no longer describe it (or
the experiment code) as untracked.

Co-Authored-By: Claude Sonnet 5.5 <noreply@anthropic.com>
</commit_message>
<xml_diff>
--- a/docs/CAST_CFG_실험_인수인계_보고서.docx
+++ b/docs/CAST_CFG_실험_인수인계_보고서.docx
@@ -549,7 +549,7 @@
                 <w:sz w:val="18"/>
                 <w:szCs w:val="18"/>
               </w:rPr>
-              <w:t xml:space="preserve">브랜치 wonseok/advisor-feedback 생성 / 이번 실험 코드와 결과는 미커밋 상태 (9.1절, 10장 참조)</w:t>
+              <w:t xml:space="preserve">브랜치 wonseok/advisor-feedback에 커밋·푸시 완료 (main 미변경). 자세한 변경점은 저장소 CLAUDE.md 참조</w:t>
             </w:r>
           </w:p>
         </w:tc>
@@ -6731,7 +6731,7 @@
           <w:sz w:val="20"/>
           <w:szCs w:val="20"/>
         </w:rPr>
-        <w:t xml:space="preserve">저장소에 올라가 있지 않은(untracked) 팀원 파일이므로 임의 수정/커밋 금지.</w:t>
+        <w:t xml:space="preserve">팀원 제작 파일(사전 고정, 이 브랜치에 포함)이므로 임의로 수정하지 않는다.</w:t>
       </w:r>
       <w:r>
         <w:rPr>
@@ -16650,7 +16650,7 @@
         <w:rPr>
           <w:rFonts w:ascii="Malgun Gothic" w:cs="Malgun Gothic" w:eastAsia="Malgun Gothic" w:hAnsi="Malgun Gothic"/>
         </w:rPr>
-        <w:t xml:space="preserve">9.1 새로 만든 코드 (모두 미커밋)</w:t>
+        <w:t xml:space="preserve">9.1 새로 만든 코드 (브랜치 wonseok/advisor-feedback에 커밋됨)</w:t>
       </w:r>
     </w:p>
     <w:tbl>
@@ -18448,7 +18448,7 @@
           <w:sz w:val="20"/>
           <w:szCs w:val="20"/>
         </w:rPr>
-        <w:t xml:space="preserve"> 이번 실험의 코드와 결과 CSV는 커밋/푸시하지 않았다. 올릴 때는 git add . 대신 파일을 지정할 것(팀원 파일 cast_prompts_v2.json과 대용량 outputs가 함께 올라가지 않도록). wav, latent, spectrogram은 기존 .gitignore 규칙으로 제외된다.</w:t>
+        <w:t xml:space="preserve"> 코드, 결과 CSV·그림, cast_prompts_v2.json, 이 보고서, CLAUDE.md 변경은 브랜치 wonseok/advisor-feedback에 푸시했고 main은 건드리지 않았다. wav, latent, spectrogram은 .gitignore로 제외되어 브랜치에 없다(AQAScore용 오디오는 zip을 별도 전달). 새로 올릴 때는 git add . 대신 파일을 지정할 것.</w:t>
       </w:r>
     </w:p>
     <w:p>

</xml_diff>